<commit_message>
Add HomeScreen component and fetch daily reading
</commit_message>
<xml_diff>
--- a/docs/SPMP.docx
+++ b/docs/SPMP.docx
@@ -857,7 +857,7 @@
     <w:p>
       <w:pPr>
         <w:rPr>
-          <w:rFonts w:eastAsiaTheme="majorEastAsia" w:cstheme="majorBidi"/>
+          <w:rFonts w:eastAsiaTheme="majorEastAsia" w:cs="Arial"/>
           <w:b/>
           <w:bCs/>
           <w:color w:val="071320" w:themeColor="text2" w:themeShade="80"/>
@@ -870,7 +870,7 @@
       </w:pPr>
       <w:r>
         <w:rPr>
-          <w:rFonts w:eastAsiaTheme="majorEastAsia" w:cstheme="majorBidi"/>
+          <w:rFonts w:eastAsiaTheme="majorEastAsia" w:cs="Arial"/>
           <w:b/>
           <w:bCs/>
           <w:color w:val="071320" w:themeColor="text2" w:themeShade="80"/>
@@ -886,13 +886,13 @@
     <w:p>
       <w:pPr>
         <w:rPr>
-          <w:rFonts w:eastAsiaTheme="majorEastAsia"/>
-          <w:lang w:val="en-ZA"/>
-        </w:rPr>
-      </w:pPr>
-      <w:r>
-        <w:rPr>
-          <w:rFonts w:eastAsiaTheme="majorEastAsia"/>
+          <w:rFonts w:eastAsiaTheme="majorEastAsia" w:cs="Arial"/>
+          <w:lang w:val="en-ZA"/>
+        </w:rPr>
+      </w:pPr>
+      <w:r>
+        <w:rPr>
+          <w:rFonts w:eastAsiaTheme="majorEastAsia" w:cs="Arial"/>
           <w:lang w:val="en-ZA"/>
         </w:rPr>
         <w:t>The objective of this project is to develop a cross-platform mobile application for Word Alive Ministries. The product will allow the ministry to distribute daily scripture readings, manage Bible study schedules, and send announcements, while allowing users to track their reading progress and submit prayer requests.</w:t>
@@ -901,8 +901,14 @@
     <w:p>
       <w:pPr>
         <w:pStyle w:val="Heading1"/>
-      </w:pPr>
-      <w:r>
+        <w:rPr>
+          <w:rFonts w:cs="Arial"/>
+        </w:rPr>
+      </w:pPr>
+      <w:r>
+        <w:rPr>
+          <w:rFonts w:cs="Arial"/>
+        </w:rPr>
         <w:t>2. Functional Requirements</w:t>
       </w:r>
     </w:p>
@@ -946,21 +952,7 @@
           <w:rFonts w:cs="Arial"/>
           <w:lang w:val="en-ZA"/>
         </w:rPr>
-        <w:t xml:space="preserve"> Users must be able to view and read a daily assigned scripture</w:t>
-      </w:r>
-      <w:r>
-        <w:rPr>
-          <w:rFonts w:cs="Arial"/>
-          <w:lang w:val="en-ZA"/>
-        </w:rPr>
-        <w:t>.</w:t>
-      </w:r>
-      <w:r>
-        <w:rPr>
-          <w:rFonts w:cs="Arial"/>
-          <w:lang w:val="en-ZA"/>
-        </w:rPr>
-        <w:t xml:space="preserve"> </w:t>
+        <w:t xml:space="preserve"> Users must be able to view and read a daily assigned scripture. </w:t>
       </w:r>
     </w:p>
     <w:p>
@@ -1106,8 +1098,14 @@
     <w:p>
       <w:pPr>
         <w:pStyle w:val="Heading1"/>
-      </w:pPr>
-      <w:r>
+        <w:rPr>
+          <w:rFonts w:cs="Arial"/>
+        </w:rPr>
+      </w:pPr>
+      <w:r>
+        <w:rPr>
+          <w:rFonts w:cs="Arial"/>
+        </w:rPr>
         <w:t>3. Non-Functional Requirements</w:t>
       </w:r>
     </w:p>
@@ -1119,11 +1117,13 @@
           <w:numId w:val="4"/>
         </w:numPr>
         <w:rPr>
-          <w:lang w:val="en-ZA"/>
-        </w:rPr>
-      </w:pPr>
-      <w:r>
-        <w:rPr>
+          <w:rFonts w:cs="Arial"/>
+          <w:lang w:val="en-ZA"/>
+        </w:rPr>
+      </w:pPr>
+      <w:r>
+        <w:rPr>
+          <w:rFonts w:cs="Arial"/>
           <w:b/>
           <w:bCs/>
           <w:lang w:val="en-ZA"/>
@@ -1132,18 +1132,21 @@
       </w:r>
       <w:r>
         <w:rPr>
+          <w:rFonts w:cs="Arial"/>
           <w:lang w:val="en-ZA"/>
         </w:rPr>
         <w:t xml:space="preserve">: The user interface must strictly adhere to the Word Alive Ministries branding guidelines, utilizing the specified green, gold, and cream </w:t>
       </w:r>
       <w:r>
         <w:rPr>
+          <w:rFonts w:cs="Arial"/>
           <w:lang w:val="en-ZA"/>
         </w:rPr>
         <w:t>colour</w:t>
       </w:r>
       <w:r>
         <w:rPr>
+          <w:rFonts w:cs="Arial"/>
           <w:lang w:val="en-ZA"/>
         </w:rPr>
         <w:t xml:space="preserve"> palette and official logo.</w:t>
@@ -1157,11 +1160,13 @@
           <w:numId w:val="4"/>
         </w:numPr>
         <w:rPr>
-          <w:lang w:val="en-ZA"/>
-        </w:rPr>
-      </w:pPr>
-      <w:r>
-        <w:rPr>
+          <w:rFonts w:cs="Arial"/>
+          <w:lang w:val="en-ZA"/>
+        </w:rPr>
+      </w:pPr>
+      <w:r>
+        <w:rPr>
+          <w:rFonts w:cs="Arial"/>
           <w:b/>
           <w:bCs/>
           <w:lang w:val="en-ZA"/>
@@ -1170,6 +1175,7 @@
       </w:r>
       <w:r>
         <w:rPr>
+          <w:rFonts w:cs="Arial"/>
           <w:lang w:val="en-ZA"/>
         </w:rPr>
         <w:t>: The application must be fully functional on both Android and iOS devices.</w:t>
@@ -1178,88 +1184,56 @@
     <w:p>
       <w:pPr>
         <w:rPr>
+          <w:rFonts w:cs="Arial"/>
           <w:lang w:val="en-ZA"/>
         </w:rPr>
       </w:pPr>
     </w:p>
     <w:p>
-      <w:r>
-        <w:rPr>
+      <w:pPr>
+        <w:rPr>
+          <w:rFonts w:cs="Arial"/>
+        </w:rPr>
+      </w:pPr>
+      <w:r>
+        <w:rPr>
+          <w:rFonts w:cs="Arial"/>
           <w:color w:val="FF0000"/>
         </w:rPr>
-        <w:t>T</w:t>
-      </w:r>
-      <w:r>
-        <w:rPr>
-          <w:color w:val="FF0000"/>
-        </w:rPr>
-        <w:t xml:space="preserve">he next phase after </w:t>
-      </w:r>
-      <w:r>
-        <w:rPr>
-          <w:color w:val="FF0000"/>
-        </w:rPr>
-        <w:t>(I</w:t>
-      </w:r>
-      <w:r>
-        <w:rPr>
-          <w:color w:val="FF0000"/>
-        </w:rPr>
-        <w:t xml:space="preserve">nitial </w:t>
-      </w:r>
-      <w:r>
-        <w:rPr>
-          <w:color w:val="FF0000"/>
-        </w:rPr>
-        <w:t>R</w:t>
-      </w:r>
-      <w:r>
-        <w:rPr>
-          <w:color w:val="FF0000"/>
-        </w:rPr>
-        <w:t>equirements</w:t>
-      </w:r>
-      <w:r>
-        <w:rPr>
-          <w:color w:val="FF0000"/>
-        </w:rPr>
-        <w:t>)</w:t>
-      </w:r>
-      <w:r>
-        <w:rPr>
-          <w:color w:val="FF0000"/>
-        </w:rPr>
-        <w:t xml:space="preserve"> is the Analysis Workflow, where we refine these use cases into a more detailed format (like </w:t>
-      </w:r>
-      <w:r>
-        <w:rPr>
-          <w:color w:val="FF0000"/>
-        </w:rPr>
-        <w:t xml:space="preserve">noun </w:t>
-      </w:r>
-      <w:r>
-        <w:rPr>
-          <w:color w:val="FF0000"/>
-        </w:rPr>
-        <w:t>extracting specific data fields) before we start designing the architecture</w:t>
-      </w:r>
-      <w:r>
+        <w:t>The next phase after (Initial Requirements) is the Analysis Workflow, where we refine these use cases into a more detailed format (like noun extracting specific data fields) before we start designing the architecture</w:t>
+      </w:r>
+      <w:r>
+        <w:rPr>
+          <w:rFonts w:cs="Arial"/>
+        </w:rPr>
         <w:t>.</w:t>
       </w:r>
     </w:p>
     <w:p>
       <w:pPr>
         <w:spacing w:after="160" w:line="278" w:lineRule="auto"/>
-      </w:pPr>
-      <w:r>
+        <w:rPr>
+          <w:rFonts w:cs="Arial"/>
+        </w:rPr>
+      </w:pPr>
+      <w:r>
+        <w:rPr>
+          <w:rFonts w:cs="Arial"/>
+        </w:rPr>
         <w:br w:type="page"/>
       </w:r>
     </w:p>
     <w:p>
       <w:pPr>
         <w:pStyle w:val="Heading1"/>
-      </w:pPr>
-      <w:r>
+        <w:rPr>
+          <w:rFonts w:cs="Arial"/>
+        </w:rPr>
+      </w:pPr>
+      <w:r>
+        <w:rPr>
+          <w:rFonts w:cs="Arial"/>
+        </w:rPr>
         <w:lastRenderedPageBreak/>
         <w:t>4. Data Dictionary analysis</w:t>
       </w:r>
@@ -1267,17 +1241,20 @@
     <w:p>
       <w:pPr>
         <w:rPr>
-          <w:lang w:val="en-ZA"/>
-        </w:rPr>
-      </w:pPr>
-      <w:r>
-        <w:rPr>
+          <w:rFonts w:cs="Arial"/>
+          <w:lang w:val="en-ZA"/>
+        </w:rPr>
+      </w:pPr>
+      <w:r>
+        <w:rPr>
+          <w:rFonts w:cs="Arial"/>
           <w:lang w:val="en-ZA"/>
         </w:rPr>
         <w:t>Functional Requirement</w:t>
       </w:r>
       <w:r>
         <w:rPr>
+          <w:rFonts w:cs="Arial"/>
           <w:lang w:val="en-ZA"/>
         </w:rPr>
         <w:tab/>
@@ -1302,11 +1279,13 @@
           <w:p>
             <w:pPr>
               <w:rPr>
+                <w:rFonts w:cs="Arial"/>
                 <w:lang w:val="en-ZA"/>
               </w:rPr>
             </w:pPr>
             <w:r>
               <w:rPr>
+                <w:rFonts w:cs="Arial"/>
                 <w:lang w:val="en-ZA"/>
               </w:rPr>
               <w:t>1. Daily Scripture</w:t>
@@ -1320,11 +1299,13 @@
           <w:p>
             <w:pPr>
               <w:rPr>
+                <w:rFonts w:cs="Arial"/>
                 <w:lang w:val="en-ZA"/>
               </w:rPr>
             </w:pPr>
             <w:r>
               <w:rPr>
+                <w:rFonts w:cs="Arial"/>
                 <w:lang w:val="en-ZA"/>
               </w:rPr>
               <w:t>Date (e.g., 27 August 2026), Scripture Reference (e.g., Romans 8:1-17), Scripture Text snippet, Content URL.</w:t>
@@ -1340,11 +1321,13 @@
           <w:p>
             <w:pPr>
               <w:rPr>
+                <w:rFonts w:cs="Arial"/>
                 <w:lang w:val="en-ZA"/>
               </w:rPr>
             </w:pPr>
             <w:r>
               <w:rPr>
+                <w:rFonts w:cs="Arial"/>
                 <w:lang w:val="en-ZA"/>
               </w:rPr>
               <w:t>2. Bible Study</w:t>
@@ -1358,11 +1341,13 @@
           <w:p>
             <w:pPr>
               <w:rPr>
+                <w:rFonts w:cs="Arial"/>
                 <w:lang w:val="en-ZA"/>
               </w:rPr>
             </w:pPr>
             <w:r>
               <w:rPr>
+                <w:rFonts w:cs="Arial"/>
                 <w:lang w:val="en-ZA"/>
               </w:rPr>
               <w:t>Study Name, Assigned Chapter (e.g., Romans 8), Scheduled Date, Scheduled Time (e.g., 19:00 - 20:00).</w:t>
@@ -1378,11 +1363,13 @@
           <w:p>
             <w:pPr>
               <w:rPr>
+                <w:rFonts w:cs="Arial"/>
                 <w:lang w:val="en-ZA"/>
               </w:rPr>
             </w:pPr>
             <w:r>
               <w:rPr>
+                <w:rFonts w:cs="Arial"/>
                 <w:lang w:val="en-ZA"/>
               </w:rPr>
               <w:t>3. Progress Tracking</w:t>
@@ -1396,11 +1383,13 @@
           <w:p>
             <w:pPr>
               <w:rPr>
+                <w:rFonts w:cs="Arial"/>
                 <w:lang w:val="en-ZA"/>
               </w:rPr>
             </w:pPr>
             <w:r>
               <w:rPr>
+                <w:rFonts w:cs="Arial"/>
                 <w:lang w:val="en-ZA"/>
               </w:rPr>
               <w:t>User ID, Current Streak (e.g., 12 Days), Total Completed (e.g., 42 of 66), Completion Percentage (e.g., 64%).</w:t>
@@ -1416,11 +1405,13 @@
           <w:p>
             <w:pPr>
               <w:rPr>
+                <w:rFonts w:cs="Arial"/>
                 <w:lang w:val="en-ZA"/>
               </w:rPr>
             </w:pPr>
             <w:r>
               <w:rPr>
+                <w:rFonts w:cs="Arial"/>
                 <w:lang w:val="en-ZA"/>
               </w:rPr>
               <w:t>4. Prayer Section</w:t>
@@ -1434,11 +1425,13 @@
           <w:p>
             <w:pPr>
               <w:rPr>
+                <w:rFonts w:cs="Arial"/>
                 <w:lang w:val="en-ZA"/>
               </w:rPr>
             </w:pPr>
             <w:r>
               <w:rPr>
+                <w:rFonts w:cs="Arial"/>
                 <w:lang w:val="en-ZA"/>
               </w:rPr>
               <w:t>User ID, Request Description, Submission Timestamp, Status (Pending/Reviewed).</w:t>
@@ -1454,11 +1447,13 @@
           <w:p>
             <w:pPr>
               <w:rPr>
+                <w:rFonts w:cs="Arial"/>
                 <w:lang w:val="en-ZA"/>
               </w:rPr>
             </w:pPr>
             <w:r>
               <w:rPr>
+                <w:rFonts w:cs="Arial"/>
                 <w:lang w:val="en-ZA"/>
               </w:rPr>
               <w:t>5. Ministry Updates</w:t>
@@ -1472,11 +1467,13 @@
           <w:p>
             <w:pPr>
               <w:rPr>
+                <w:rFonts w:cs="Arial"/>
                 <w:lang w:val="en-ZA"/>
               </w:rPr>
             </w:pPr>
             <w:r>
               <w:rPr>
+                <w:rFonts w:cs="Arial"/>
                 <w:lang w:val="en-ZA"/>
               </w:rPr>
               <w:t>Announcement Text (e.g., "Join us for our Align &amp; Prosper..."), Broadcast Date, Expiration Date.</w:t>
@@ -1492,11 +1489,13 @@
           <w:p>
             <w:pPr>
               <w:rPr>
+                <w:rFonts w:cs="Arial"/>
                 <w:lang w:val="en-ZA"/>
               </w:rPr>
             </w:pPr>
             <w:r>
               <w:rPr>
+                <w:rFonts w:cs="Arial"/>
                 <w:lang w:val="en-ZA"/>
               </w:rPr>
               <w:t>6. Admin Dashboard</w:t>
@@ -1510,11 +1509,13 @@
           <w:p>
             <w:pPr>
               <w:rPr>
+                <w:rFonts w:cs="Arial"/>
                 <w:lang w:val="en-ZA"/>
               </w:rPr>
             </w:pPr>
             <w:r>
               <w:rPr>
+                <w:rFonts w:cs="Arial"/>
                 <w:lang w:val="en-ZA"/>
               </w:rPr>
               <w:t>Admin User ID, Content ID (Reading/Announcement/Study), Action Timestamp.</w:t>
@@ -1530,11 +1531,13 @@
           <w:p>
             <w:pPr>
               <w:rPr>
+                <w:rFonts w:cs="Arial"/>
                 <w:lang w:val="en-ZA"/>
               </w:rPr>
             </w:pPr>
             <w:r>
               <w:rPr>
+                <w:rFonts w:cs="Arial"/>
                 <w:lang w:val="en-ZA"/>
               </w:rPr>
               <w:t>7. Live Stream</w:t>
@@ -1548,29 +1551,34 @@
           <w:p>
             <w:pPr>
               <w:rPr>
+                <w:rFonts w:cs="Arial"/>
                 <w:lang w:val="en-ZA"/>
               </w:rPr>
             </w:pPr>
             <w:r>
               <w:rPr>
+                <w:rFonts w:cs="Arial"/>
                 <w:lang w:val="en-ZA"/>
               </w:rPr>
               <w:t xml:space="preserve">Connect User to Live stream on </w:t>
             </w:r>
             <w:r>
               <w:rPr>
+                <w:rFonts w:cs="Arial"/>
                 <w:lang w:val="en-ZA"/>
               </w:rPr>
               <w:t>T</w:t>
             </w:r>
             <w:r>
               <w:rPr>
+                <w:rFonts w:cs="Arial"/>
                 <w:lang w:val="en-ZA"/>
               </w:rPr>
               <w:t xml:space="preserve">ik </w:t>
             </w:r>
             <w:r>
               <w:rPr>
+                <w:rFonts w:cs="Arial"/>
                 <w:lang w:val="en-ZA"/>
               </w:rPr>
               <w:t>Tok</w:t>
@@ -1737,51 +1745,95 @@
     <w:p>
       <w:pPr>
         <w:pStyle w:val="Heading1"/>
-      </w:pPr>
-      <w:r>
+        <w:rPr>
+          <w:rFonts w:cs="Arial"/>
+        </w:rPr>
+      </w:pPr>
+      <w:r>
+        <w:rPr>
+          <w:rFonts w:cs="Arial"/>
+        </w:rPr>
         <w:t>5. Database Schema Design (Supabase/PostgreSQL)</w:t>
       </w:r>
     </w:p>
     <w:p>
       <w:pPr>
         <w:rPr>
-          <w:lang w:val="en-ZA"/>
-        </w:rPr>
-      </w:pPr>
-      <w:r>
-        <w:rPr>
+          <w:rFonts w:cs="Arial"/>
+          <w:lang w:val="en-ZA"/>
+        </w:rPr>
+      </w:pPr>
+      <w:r>
+        <w:rPr>
+          <w:rFonts w:cs="Arial"/>
           <w:lang w:val="en-ZA"/>
         </w:rPr>
         <w:t xml:space="preserve">To support the functional requirements and data dictionary, the database will utilize the following </w:t>
       </w:r>
       <w:r>
-        <w:t>relational tables. Foreign Keys (FK) will be used to link user activity to specific content, ensuring data integrity.</w:t>
-      </w:r>
-      <w:r>
-        <w:rPr>
+        <w:rPr>
+          <w:rFonts w:cs="Arial"/>
+        </w:rPr>
+        <w:t xml:space="preserve">relational tables. Foreign Keys (FK) will </w:t>
+      </w:r>
+      <w:proofErr w:type="gramStart"/>
+      <w:r>
+        <w:rPr>
+          <w:rFonts w:cs="Arial"/>
+        </w:rPr>
+        <w:t>be used</w:t>
+      </w:r>
+      <w:proofErr w:type="gramEnd"/>
+      <w:r>
+        <w:rPr>
+          <w:rFonts w:cs="Arial"/>
+        </w:rPr>
+        <w:t xml:space="preserve"> to link user activity to specific content, ensuring data integrity.</w:t>
+      </w:r>
+      <w:r>
+        <w:rPr>
+          <w:rFonts w:cs="Arial"/>
           <w:lang w:val="en-ZA"/>
         </w:rPr>
         <w:t xml:space="preserve"> </w:t>
       </w:r>
       <w:r>
+        <w:rPr>
+          <w:rFonts w:cs="Arial"/>
+        </w:rPr>
         <w:t>I plan</w:t>
       </w:r>
       <w:r>
-        <w:t xml:space="preserve"> to cache this data locally on the user's device for offline reading, us</w:t>
-      </w:r>
-      <w:r>
+        <w:rPr>
+          <w:rFonts w:cs="Arial"/>
+        </w:rPr>
+        <w:t xml:space="preserve"> to </w:t>
+      </w:r>
+      <w:proofErr w:type="gramStart"/>
+      <w:r>
+        <w:rPr>
+          <w:rFonts w:cs="Arial"/>
+        </w:rPr>
+        <w:t>cache</w:t>
+      </w:r>
+      <w:proofErr w:type="gramEnd"/>
+      <w:r>
+        <w:rPr>
+          <w:rFonts w:cs="Arial"/>
+        </w:rPr>
+        <w:t xml:space="preserve"> this data locally on the user's device for offline reading, us</w:t>
+      </w:r>
+      <w:r>
+        <w:rPr>
+          <w:rFonts w:cs="Arial"/>
+        </w:rPr>
         <w:t>ing</w:t>
       </w:r>
       <w:r>
-        <w:t xml:space="preserve"> standard React Native </w:t>
-      </w:r>
-      <w:proofErr w:type="spellStart"/>
-      <w:r>
-        <w:t>AsyncStorage</w:t>
-      </w:r>
-      <w:proofErr w:type="spellEnd"/>
-      <w:r>
-        <w:t xml:space="preserve"> </w:t>
+        <w:rPr>
+          <w:rFonts w:cs="Arial"/>
+        </w:rPr>
+        <w:t xml:space="preserve"> standard React Native AsyncStorage </w:t>
       </w:r>
     </w:p>
     <w:tbl>
@@ -1919,7 +1971,6 @@
                 <w:lang w:val="en-ZA"/>
               </w:rPr>
             </w:pPr>
-            <w:proofErr w:type="spellStart"/>
             <w:r>
               <w:rPr>
                 <w:rFonts w:cs="Arial"/>
@@ -1942,7 +1993,6 @@
               </w:rPr>
               <w:t>updated</w:t>
             </w:r>
-            <w:proofErr w:type="spellEnd"/>
             <w:r>
               <w:rPr>
                 <w:rFonts w:cs="Arial"/>
@@ -1977,7 +2027,6 @@
               </w:rPr>
               <w:t xml:space="preserve"> The app only downloads records where </w:t>
             </w:r>
-            <w:proofErr w:type="spellStart"/>
             <w:r>
               <w:rPr>
                 <w:rStyle w:val="HTMLCode"/>
@@ -1985,7 +2034,6 @@
               </w:rPr>
               <w:t>last_updated</w:t>
             </w:r>
-            <w:proofErr w:type="spellEnd"/>
             <w:r>
               <w:rPr>
                 <w:rFonts w:cs="Arial"/>
@@ -2077,7 +2125,6 @@
               </w:rPr>
               <w:br/>
             </w:r>
-            <w:proofErr w:type="spellStart"/>
             <w:r>
               <w:rPr>
                 <w:rFonts w:cs="Arial"/>
@@ -2087,7 +2134,6 @@
               </w:rPr>
               <w:t>current_streak</w:t>
             </w:r>
-            <w:proofErr w:type="spellEnd"/>
             <w:r>
               <w:rPr>
                 <w:rFonts w:cs="Arial"/>
@@ -2102,7 +2148,6 @@
               </w:rPr>
               <w:br/>
             </w:r>
-            <w:proofErr w:type="spellStart"/>
             <w:r>
               <w:rPr>
                 <w:rFonts w:cs="Arial"/>
@@ -2112,7 +2157,6 @@
               </w:rPr>
               <w:t>is_admin</w:t>
             </w:r>
-            <w:proofErr w:type="spellEnd"/>
             <w:r>
               <w:rPr>
                 <w:rFonts w:cs="Arial"/>
@@ -2134,7 +2178,6 @@
               </w:rPr>
               <w:br/>
             </w:r>
-            <w:proofErr w:type="spellStart"/>
             <w:r>
               <w:rPr>
                 <w:rStyle w:val="HTMLCode"/>
@@ -2143,7 +2186,6 @@
               <w:lastRenderedPageBreak/>
               <w:t>text_size</w:t>
             </w:r>
-            <w:proofErr w:type="spellEnd"/>
             <w:r>
               <w:rPr>
                 <w:rFonts w:cs="Arial"/>
@@ -2156,7 +2198,6 @@
               </w:rPr>
               <w:br/>
             </w:r>
-            <w:proofErr w:type="spellStart"/>
             <w:r>
               <w:rPr>
                 <w:rStyle w:val="HTMLCode"/>
@@ -2164,7 +2205,6 @@
               </w:rPr>
               <w:t>high_contrast</w:t>
             </w:r>
-            <w:proofErr w:type="spellEnd"/>
             <w:r>
               <w:rPr>
                 <w:rFonts w:cs="Arial"/>
@@ -2177,16 +2217,17 @@
               </w:rPr>
               <w:br/>
             </w:r>
-            <w:proofErr w:type="spellStart"/>
             <w:r>
               <w:rPr>
                 <w:rStyle w:val="HTMLCode"/>
-                <w:rFonts w:eastAsiaTheme="minorEastAsia"/>
+                <w:rFonts w:ascii="Arial" w:eastAsiaTheme="minorEastAsia" w:hAnsi="Arial" w:cs="Arial"/>
               </w:rPr>
               <w:t>last_updated</w:t>
             </w:r>
-            <w:proofErr w:type="spellEnd"/>
-            <w:r>
+            <w:r>
+              <w:rPr>
+                <w:rFonts w:cs="Arial"/>
+              </w:rPr>
               <w:t xml:space="preserve"> (TIMESTAMP)</w:t>
             </w:r>
           </w:p>
@@ -2242,7 +2283,6 @@
                 <w:lang w:val="en-ZA"/>
               </w:rPr>
             </w:pPr>
-            <w:proofErr w:type="spellStart"/>
             <w:r>
               <w:rPr>
                 <w:rFonts w:cs="Arial"/>
@@ -2252,7 +2292,6 @@
               </w:rPr>
               <w:t>Daily_Readings</w:t>
             </w:r>
-            <w:proofErr w:type="spellEnd"/>
           </w:p>
         </w:tc>
         <w:tc>
@@ -2300,7 +2339,6 @@
               </w:rPr>
               <w:br/>
             </w:r>
-            <w:proofErr w:type="spellStart"/>
             <w:r>
               <w:rPr>
                 <w:rFonts w:cs="Arial"/>
@@ -2310,7 +2348,6 @@
               </w:rPr>
               <w:t>scheduled_date</w:t>
             </w:r>
-            <w:proofErr w:type="spellEnd"/>
             <w:r>
               <w:rPr>
                 <w:rFonts w:cs="Arial"/>
@@ -2325,7 +2362,6 @@
               </w:rPr>
               <w:br/>
             </w:r>
-            <w:proofErr w:type="spellStart"/>
             <w:r>
               <w:rPr>
                 <w:rFonts w:cs="Arial"/>
@@ -2335,7 +2371,6 @@
               </w:rPr>
               <w:t>scripture_ref</w:t>
             </w:r>
-            <w:proofErr w:type="spellEnd"/>
             <w:r>
               <w:rPr>
                 <w:rFonts w:cs="Arial"/>
@@ -2373,7 +2408,6 @@
               </w:rPr>
               <w:br/>
             </w:r>
-            <w:proofErr w:type="spellStart"/>
             <w:r>
               <w:rPr>
                 <w:rStyle w:val="HTMLCode"/>
@@ -2399,7 +2433,6 @@
               </w:rPr>
               <w:t>url</w:t>
             </w:r>
-            <w:proofErr w:type="spellEnd"/>
             <w:r>
               <w:rPr>
                 <w:rFonts w:cs="Arial"/>
@@ -2412,7 +2445,6 @@
               </w:rPr>
               <w:br/>
             </w:r>
-            <w:proofErr w:type="spellStart"/>
             <w:r>
               <w:rPr>
                 <w:rStyle w:val="HTMLCode"/>
@@ -2438,7 +2470,6 @@
               </w:rPr>
               <w:t>number</w:t>
             </w:r>
-            <w:proofErr w:type="spellEnd"/>
             <w:r>
               <w:rPr>
                 <w:rFonts w:cs="Arial"/>
@@ -2451,16 +2482,17 @@
               </w:rPr>
               <w:br/>
             </w:r>
-            <w:proofErr w:type="spellStart"/>
             <w:r>
               <w:rPr>
                 <w:rStyle w:val="HTMLCode"/>
-                <w:rFonts w:eastAsiaTheme="minorEastAsia"/>
+                <w:rFonts w:ascii="Arial" w:eastAsiaTheme="minorEastAsia" w:hAnsi="Arial" w:cs="Arial"/>
               </w:rPr>
               <w:t>last_updated</w:t>
             </w:r>
-            <w:proofErr w:type="spellEnd"/>
-            <w:r>
+            <w:r>
+              <w:rPr>
+                <w:rFonts w:cs="Arial"/>
+              </w:rPr>
               <w:t xml:space="preserve"> (TIMESTAMP)</w:t>
             </w:r>
           </w:p>
@@ -2492,7 +2524,6 @@
               </w:rPr>
               <w:t xml:space="preserve"> </w:t>
             </w:r>
-            <w:proofErr w:type="spellStart"/>
             <w:r>
               <w:rPr>
                 <w:rStyle w:val="HTMLCode"/>
@@ -2500,14 +2531,12 @@
               </w:rPr>
               <w:t>audio_url</w:t>
             </w:r>
-            <w:proofErr w:type="spellEnd"/>
             <w:r>
               <w:rPr>
                 <w:rFonts w:cs="Arial"/>
               </w:rPr>
               <w:t xml:space="preserve"> helps children and the visually impaired. </w:t>
             </w:r>
-            <w:proofErr w:type="spellStart"/>
             <w:r>
               <w:rPr>
                 <w:rStyle w:val="HTMLCode"/>
@@ -2515,7 +2544,6 @@
               </w:rPr>
               <w:t>week_number</w:t>
             </w:r>
-            <w:proofErr w:type="spellEnd"/>
             <w:r>
               <w:rPr>
                 <w:rFonts w:cs="Arial"/>
@@ -2538,7 +2566,6 @@
                 <w:lang w:val="en-ZA"/>
               </w:rPr>
             </w:pPr>
-            <w:proofErr w:type="spellStart"/>
             <w:r>
               <w:rPr>
                 <w:rFonts w:cs="Arial"/>
@@ -2548,7 +2575,6 @@
               </w:rPr>
               <w:t>Bible_Studies</w:t>
             </w:r>
-            <w:proofErr w:type="spellEnd"/>
           </w:p>
         </w:tc>
         <w:tc>
@@ -2577,17 +2603,24 @@
                 <w:rFonts w:cs="Arial"/>
                 <w:lang w:val="en-ZA"/>
               </w:rPr>
-              <w:t xml:space="preserve"> (UUID, PK), </w:t>
-            </w:r>
-            <w:proofErr w:type="spellStart"/>
-            <w:r>
-              <w:rPr>
-                <w:rFonts w:cs="Arial"/>
-                <w:lang w:val="en-ZA"/>
-              </w:rPr>
-              <w:t>study_name</w:t>
-            </w:r>
-            <w:proofErr w:type="spellEnd"/>
+              <w:t xml:space="preserve"> (UUID, PK), study_name (VARCHAR), </w:t>
+            </w:r>
+            <w:r>
+              <w:rPr>
+                <w:rFonts w:cs="Arial"/>
+                <w:lang w:val="en-ZA"/>
+              </w:rPr>
+              <w:br/>
+            </w:r>
+            <w:r>
+              <w:rPr>
+                <w:rFonts w:cs="Arial"/>
+                <w:b/>
+                <w:bCs/>
+                <w:lang w:val="en-ZA"/>
+              </w:rPr>
+              <w:t>chapter</w:t>
+            </w:r>
             <w:r>
               <w:rPr>
                 <w:rFonts w:cs="Arial"/>
@@ -2609,14 +2642,14 @@
                 <w:bCs/>
                 <w:lang w:val="en-ZA"/>
               </w:rPr>
-              <w:t>chapter</w:t>
-            </w:r>
-            <w:r>
-              <w:rPr>
-                <w:rFonts w:cs="Arial"/>
-                <w:lang w:val="en-ZA"/>
-              </w:rPr>
-              <w:t xml:space="preserve"> (VARCHAR), </w:t>
+              <w:t>scheduled_time</w:t>
+            </w:r>
+            <w:r>
+              <w:rPr>
+                <w:rFonts w:cs="Arial"/>
+                <w:lang w:val="en-ZA"/>
+              </w:rPr>
+              <w:t xml:space="preserve"> (TIMESTAMP)</w:t>
             </w:r>
             <w:r>
               <w:rPr>
@@ -2625,41 +2658,19 @@
               </w:rPr>
               <w:br/>
             </w:r>
-            <w:proofErr w:type="spellStart"/>
-            <w:r>
-              <w:rPr>
-                <w:rFonts w:cs="Arial"/>
-                <w:b/>
-                <w:bCs/>
-                <w:lang w:val="en-ZA"/>
-              </w:rPr>
-              <w:t>scheduled_time</w:t>
-            </w:r>
-            <w:proofErr w:type="spellEnd"/>
-            <w:r>
-              <w:rPr>
-                <w:rFonts w:cs="Arial"/>
-                <w:lang w:val="en-ZA"/>
-              </w:rPr>
-              <w:t xml:space="preserve"> (TIMESTAMP)</w:t>
-            </w:r>
-            <w:r>
-              <w:rPr>
-                <w:rFonts w:cs="Arial"/>
-                <w:lang w:val="en-ZA"/>
-              </w:rPr>
-              <w:br/>
-            </w:r>
-            <w:proofErr w:type="spellStart"/>
             <w:r>
               <w:rPr>
                 <w:rStyle w:val="HTMLCode"/>
-                <w:rFonts w:eastAsiaTheme="minorEastAsia"/>
+                <w:rFonts w:ascii="Arial" w:eastAsiaTheme="minorEastAsia" w:hAnsi="Arial" w:cs="Arial"/>
+                <w:b/>
+                <w:bCs/>
               </w:rPr>
               <w:t>last_updated</w:t>
             </w:r>
-            <w:proofErr w:type="spellEnd"/>
-            <w:r>
+            <w:r>
+              <w:rPr>
+                <w:rFonts w:cs="Arial"/>
+              </w:rPr>
               <w:t xml:space="preserve"> (TIMESTAMP)</w:t>
             </w:r>
           </w:p>
@@ -2693,7 +2704,6 @@
                 <w:lang w:val="en-ZA"/>
               </w:rPr>
             </w:pPr>
-            <w:proofErr w:type="spellStart"/>
             <w:r>
               <w:rPr>
                 <w:rFonts w:cs="Arial"/>
@@ -2703,7 +2713,6 @@
               </w:rPr>
               <w:t>User_Progress</w:t>
             </w:r>
-            <w:proofErr w:type="spellEnd"/>
           </w:p>
         </w:tc>
         <w:tc>
@@ -2741,7 +2750,6 @@
               </w:rPr>
               <w:br/>
             </w:r>
-            <w:proofErr w:type="spellStart"/>
             <w:r>
               <w:rPr>
                 <w:rFonts w:cs="Arial"/>
@@ -2751,7 +2759,6 @@
               </w:rPr>
               <w:t>user_id</w:t>
             </w:r>
-            <w:proofErr w:type="spellEnd"/>
             <w:r>
               <w:rPr>
                 <w:rFonts w:cs="Arial"/>
@@ -2766,7 +2773,6 @@
               </w:rPr>
               <w:br/>
             </w:r>
-            <w:proofErr w:type="spellStart"/>
             <w:r>
               <w:rPr>
                 <w:rFonts w:cs="Arial"/>
@@ -2776,7 +2782,6 @@
               </w:rPr>
               <w:t>reading_id</w:t>
             </w:r>
-            <w:proofErr w:type="spellEnd"/>
             <w:r>
               <w:rPr>
                 <w:rFonts w:cs="Arial"/>
@@ -2791,7 +2796,6 @@
               </w:rPr>
               <w:br/>
             </w:r>
-            <w:proofErr w:type="spellStart"/>
             <w:r>
               <w:rPr>
                 <w:rFonts w:cs="Arial"/>
@@ -2801,7 +2805,6 @@
               </w:rPr>
               <w:t>completed_at</w:t>
             </w:r>
-            <w:proofErr w:type="spellEnd"/>
             <w:r>
               <w:rPr>
                 <w:rFonts w:cs="Arial"/>
@@ -2816,16 +2819,35 @@
               </w:rPr>
               <w:br/>
             </w:r>
-            <w:proofErr w:type="spellStart"/>
             <w:r>
               <w:rPr>
                 <w:rStyle w:val="HTMLCode"/>
-                <w:rFonts w:eastAsiaTheme="minorEastAsia"/>
-              </w:rPr>
-              <w:t>last_updated</w:t>
-            </w:r>
-            <w:proofErr w:type="spellEnd"/>
-            <w:r>
+                <w:rFonts w:ascii="Arial" w:eastAsiaTheme="minorEastAsia" w:hAnsi="Arial" w:cs="Arial"/>
+                <w:b/>
+                <w:bCs/>
+              </w:rPr>
+              <w:t>last</w:t>
+            </w:r>
+            <w:r>
+              <w:rPr>
+                <w:rStyle w:val="HTMLCode"/>
+                <w:rFonts w:ascii="Arial" w:eastAsiaTheme="minorEastAsia" w:hAnsi="Arial" w:cs="Arial"/>
+              </w:rPr>
+              <w:t>_</w:t>
+            </w:r>
+            <w:r>
+              <w:rPr>
+                <w:rStyle w:val="HTMLCode"/>
+                <w:rFonts w:ascii="Arial" w:eastAsiaTheme="minorEastAsia" w:hAnsi="Arial" w:cs="Arial"/>
+                <w:b/>
+                <w:bCs/>
+              </w:rPr>
+              <w:t>updated</w:t>
+            </w:r>
+            <w:r>
+              <w:rPr>
+                <w:rFonts w:cs="Arial"/>
+              </w:rPr>
               <w:t xml:space="preserve"> (TIMESTAMP)</w:t>
             </w:r>
           </w:p>
@@ -2859,7 +2881,6 @@
                 <w:lang w:val="en-ZA"/>
               </w:rPr>
             </w:pPr>
-            <w:proofErr w:type="spellStart"/>
             <w:r>
               <w:rPr>
                 <w:rFonts w:cs="Arial"/>
@@ -2869,7 +2890,6 @@
               </w:rPr>
               <w:t>Prayer_Requests</w:t>
             </w:r>
-            <w:proofErr w:type="spellEnd"/>
           </w:p>
         </w:tc>
         <w:tc>
@@ -2907,7 +2927,6 @@
               </w:rPr>
               <w:br/>
             </w:r>
-            <w:proofErr w:type="spellStart"/>
             <w:r>
               <w:rPr>
                 <w:rFonts w:cs="Arial"/>
@@ -2917,7 +2936,6 @@
               </w:rPr>
               <w:t>user_id</w:t>
             </w:r>
-            <w:proofErr w:type="spellEnd"/>
             <w:r>
               <w:rPr>
                 <w:rFonts w:cs="Arial"/>
@@ -2985,7 +3003,6 @@
               </w:rPr>
               <w:br/>
             </w:r>
-            <w:proofErr w:type="spellStart"/>
             <w:r>
               <w:rPr>
                 <w:rFonts w:cs="Arial"/>
@@ -3004,7 +3021,6 @@
               </w:rPr>
               <w:t>_at</w:t>
             </w:r>
-            <w:proofErr w:type="spellEnd"/>
             <w:r>
               <w:rPr>
                 <w:rFonts w:cs="Arial"/>
@@ -3019,16 +3035,19 @@
               </w:rPr>
               <w:br/>
             </w:r>
-            <w:proofErr w:type="spellStart"/>
             <w:r>
               <w:rPr>
                 <w:rStyle w:val="HTMLCode"/>
-                <w:rFonts w:eastAsiaTheme="minorEastAsia"/>
+                <w:rFonts w:ascii="Arial" w:eastAsiaTheme="minorEastAsia" w:hAnsi="Arial" w:cs="Arial"/>
+                <w:b/>
+                <w:bCs/>
               </w:rPr>
               <w:t>last_updated</w:t>
             </w:r>
-            <w:proofErr w:type="spellEnd"/>
-            <w:r>
+            <w:r>
+              <w:rPr>
+                <w:rFonts w:cs="Arial"/>
+              </w:rPr>
               <w:t xml:space="preserve"> (TIMESTAMP)</w:t>
             </w:r>
           </w:p>
@@ -3131,7 +3150,6 @@
               </w:rPr>
               <w:br/>
             </w:r>
-            <w:proofErr w:type="spellStart"/>
             <w:r>
               <w:rPr>
                 <w:rFonts w:cs="Arial"/>
@@ -3157,7 +3175,6 @@
               </w:rPr>
               <w:t>date</w:t>
             </w:r>
-            <w:proofErr w:type="spellEnd"/>
             <w:r>
               <w:rPr>
                 <w:rFonts w:cs="Arial"/>
@@ -3172,25 +3189,14 @@
               </w:rPr>
               <w:br/>
             </w:r>
-            <w:proofErr w:type="spellStart"/>
-            <w:r>
-              <w:rPr>
-                <w:rFonts w:cs="Arial"/>
-                <w:b/>
-                <w:bCs/>
-                <w:lang w:val="en-ZA"/>
-              </w:rPr>
-              <w:t>expires_at</w:t>
-            </w:r>
-            <w:proofErr w:type="spellEnd"/>
-            <w:r>
-              <w:rPr>
-                <w:rFonts w:cs="Arial"/>
-                <w:b/>
-                <w:bCs/>
-                <w:lang w:val="en-ZA"/>
-              </w:rPr>
-              <w:t xml:space="preserve"> </w:t>
+            <w:r>
+              <w:rPr>
+                <w:rFonts w:cs="Arial"/>
+                <w:b/>
+                <w:bCs/>
+                <w:lang w:val="en-ZA"/>
+              </w:rPr>
+              <w:t xml:space="preserve">expires_at </w:t>
             </w:r>
             <w:r>
               <w:rPr>
@@ -3213,16 +3219,17 @@
               </w:rPr>
               <w:br/>
             </w:r>
-            <w:proofErr w:type="spellStart"/>
             <w:r>
               <w:rPr>
                 <w:rStyle w:val="HTMLCode"/>
-                <w:rFonts w:eastAsiaTheme="minorEastAsia"/>
+                <w:rFonts w:ascii="Arial" w:eastAsiaTheme="minorEastAsia" w:hAnsi="Arial" w:cs="Arial"/>
               </w:rPr>
               <w:t>last_updated</w:t>
             </w:r>
-            <w:proofErr w:type="spellEnd"/>
-            <w:r>
+            <w:r>
+              <w:rPr>
+                <w:rFonts w:cs="Arial"/>
+              </w:rPr>
               <w:t xml:space="preserve"> (TIMESTAMP)</w:t>
             </w:r>
           </w:p>
@@ -3256,7 +3263,6 @@
                 <w:lang w:val="en-ZA"/>
               </w:rPr>
             </w:pPr>
-            <w:proofErr w:type="spellStart"/>
             <w:r>
               <w:rPr>
                 <w:rFonts w:cs="Arial"/>
@@ -3266,7 +3272,6 @@
               </w:rPr>
               <w:t>Live_Streams</w:t>
             </w:r>
-            <w:proofErr w:type="spellEnd"/>
           </w:p>
         </w:tc>
         <w:tc>
@@ -3327,7 +3332,6 @@
               </w:rPr>
               <w:br/>
             </w:r>
-            <w:proofErr w:type="spellStart"/>
             <w:r>
               <w:rPr>
                 <w:rFonts w:cs="Arial"/>
@@ -3337,7 +3341,6 @@
               </w:rPr>
               <w:t>stream_url</w:t>
             </w:r>
-            <w:proofErr w:type="spellEnd"/>
             <w:r>
               <w:rPr>
                 <w:rFonts w:cs="Arial"/>
@@ -3352,7 +3355,6 @@
               </w:rPr>
               <w:br/>
             </w:r>
-            <w:proofErr w:type="spellStart"/>
             <w:r>
               <w:rPr>
                 <w:rFonts w:cs="Arial"/>
@@ -3362,7 +3364,6 @@
               </w:rPr>
               <w:t>is_live</w:t>
             </w:r>
-            <w:proofErr w:type="spellEnd"/>
             <w:r>
               <w:rPr>
                 <w:rFonts w:cs="Arial"/>
@@ -3377,16 +3378,17 @@
               </w:rPr>
               <w:br/>
             </w:r>
-            <w:proofErr w:type="spellStart"/>
             <w:r>
               <w:rPr>
                 <w:rStyle w:val="HTMLCode"/>
-                <w:rFonts w:eastAsiaTheme="minorEastAsia"/>
+                <w:rFonts w:ascii="Arial" w:eastAsiaTheme="minorEastAsia" w:hAnsi="Arial" w:cs="Arial"/>
               </w:rPr>
               <w:t>last_updated</w:t>
             </w:r>
-            <w:proofErr w:type="spellEnd"/>
-            <w:r>
+            <w:r>
+              <w:rPr>
+                <w:rFonts w:cs="Arial"/>
+              </w:rPr>
               <w:t xml:space="preserve"> (TIMESTAMP)</w:t>
             </w:r>
           </w:p>
@@ -3411,6 +3413,7 @@
     <w:p>
       <w:pPr>
         <w:rPr>
+          <w:rFonts w:cs="Arial"/>
           <w:lang w:val="en-ZA"/>
         </w:rPr>
       </w:pPr>
@@ -3419,25 +3422,73 @@
       <w:pPr>
         <w:pStyle w:val="Heading2"/>
         <w:rPr>
-          <w:rFonts w:ascii="Times New Roman" w:eastAsia="Times New Roman" w:hAnsi="Times New Roman"/>
+          <w:rFonts w:eastAsia="Times New Roman" w:cs="Arial"/>
           <w:szCs w:val="27"/>
         </w:rPr>
       </w:pPr>
       <w:r>
+        <w:rPr>
+          <w:rFonts w:cs="Arial"/>
+        </w:rPr>
         <w:t>Offline Architecture</w:t>
       </w:r>
     </w:p>
     <w:p>
-      <w:r>
+      <w:pPr>
+        <w:rPr>
+          <w:rFonts w:cs="Arial"/>
+        </w:rPr>
+      </w:pPr>
+      <w:r>
+        <w:rPr>
+          <w:rFonts w:cs="Arial"/>
+        </w:rPr>
         <w:t>F</w:t>
       </w:r>
       <w:r>
+        <w:rPr>
+          <w:rFonts w:cs="Arial"/>
+        </w:rPr>
         <w:t xml:space="preserve">or offline capabilities in your React Native app, </w:t>
       </w:r>
       <w:r>
-        <w:t>the following will be implemented for a specific data flow</w:t>
-      </w:r>
-      <w:r>
+        <w:rPr>
+          <w:rFonts w:cs="Arial"/>
+        </w:rPr>
+        <w:t xml:space="preserve">the following will </w:t>
+      </w:r>
+      <w:proofErr w:type="gramStart"/>
+      <w:r>
+        <w:rPr>
+          <w:rFonts w:cs="Arial"/>
+        </w:rPr>
+        <w:t>be implemented</w:t>
+      </w:r>
+      <w:proofErr w:type="gramEnd"/>
+      <w:r>
+        <w:rPr>
+          <w:rFonts w:cs="Arial"/>
+        </w:rPr>
+        <w:t xml:space="preserve"> for </w:t>
+      </w:r>
+      <w:proofErr w:type="gramStart"/>
+      <w:r>
+        <w:rPr>
+          <w:rFonts w:cs="Arial"/>
+        </w:rPr>
+        <w:t>a specific</w:t>
+      </w:r>
+      <w:proofErr w:type="gramEnd"/>
+      <w:r>
+        <w:rPr>
+          <w:rFonts w:cs="Arial"/>
+        </w:rPr>
+        <w:t xml:space="preserve"> data flow</w:t>
+      </w:r>
+      <w:r>
+        <w:rPr>
+          <w:rFonts w:cs="Arial"/>
+        </w:rPr>
         <w:t>:</w:t>
       </w:r>
     </w:p>
@@ -3448,26 +3499,34 @@
           <w:ilvl w:val="0"/>
           <w:numId w:val="6"/>
         </w:numPr>
-      </w:pPr>
-      <w:r>
-        <w:rPr>
+        <w:rPr>
+          <w:rFonts w:cs="Arial"/>
+        </w:rPr>
+      </w:pPr>
+      <w:r>
+        <w:rPr>
+          <w:rFonts w:cs="Arial"/>
           <w:b/>
           <w:bCs/>
         </w:rPr>
         <w:t>Timestamp Comparisons:</w:t>
       </w:r>
       <w:r>
+        <w:rPr>
+          <w:rFonts w:cs="Arial"/>
+        </w:rPr>
         <w:t xml:space="preserve"> </w:t>
       </w:r>
       <w:r>
-        <w:t xml:space="preserve">When the app opens with an internet connection, it should query Supabase for records where the </w:t>
-      </w:r>
-      <w:proofErr w:type="spellStart"/>
-      <w:r>
-        <w:t>last_updated</w:t>
-      </w:r>
-      <w:proofErr w:type="spellEnd"/>
-      <w:r>
+        <w:rPr>
+          <w:rFonts w:cs="Arial"/>
+        </w:rPr>
+        <w:t>When the app opens with an internet connection, it should query Supabase for records where the last_updated</w:t>
+      </w:r>
+      <w:r>
+        <w:rPr>
+          <w:rFonts w:cs="Arial"/>
+        </w:rPr>
         <w:t xml:space="preserve"> timestamp is newer than the device's last successful sync.</w:t>
       </w:r>
     </w:p>
@@ -3478,15 +3537,22 @@
           <w:ilvl w:val="0"/>
           <w:numId w:val="6"/>
         </w:numPr>
-      </w:pPr>
-      <w:r>
-        <w:rPr>
+        <w:rPr>
+          <w:rFonts w:cs="Arial"/>
+        </w:rPr>
+      </w:pPr>
+      <w:r>
+        <w:rPr>
+          <w:rFonts w:cs="Arial"/>
           <w:b/>
           <w:bCs/>
         </w:rPr>
         <w:t>Delta Downloads:</w:t>
       </w:r>
       <w:r>
+        <w:rPr>
+          <w:rFonts w:cs="Arial"/>
+        </w:rPr>
         <w:t xml:space="preserve"> Supabase will return only the newly modified data (the "deltas"), saving massive amounts of mobile data for your users.</w:t>
       </w:r>
     </w:p>
@@ -3497,9 +3563,13 @@
           <w:ilvl w:val="0"/>
           <w:numId w:val="6"/>
         </w:numPr>
-      </w:pPr>
-      <w:r>
-        <w:rPr>
+        <w:rPr>
+          <w:rFonts w:cs="Arial"/>
+        </w:rPr>
+      </w:pPr>
+      <w:r>
+        <w:rPr>
+          <w:rFonts w:cs="Arial"/>
           <w:b/>
           <w:bCs/>
         </w:rPr>
@@ -3507,15 +3577,27 @@
         <w:t>Local Caching:</w:t>
       </w:r>
       <w:r>
+        <w:rPr>
+          <w:rFonts w:cs="Arial"/>
+        </w:rPr>
         <w:t xml:space="preserve"> The React Native app must save this incoming data locally on the phone's internal </w:t>
       </w:r>
       <w:r>
+        <w:rPr>
+          <w:rFonts w:cs="Arial"/>
+        </w:rPr>
         <w:t>storage,</w:t>
       </w:r>
       <w:r>
+        <w:rPr>
+          <w:rFonts w:cs="Arial"/>
+        </w:rPr>
         <w:t xml:space="preserve"> so it is instantly available when the user has no signal</w:t>
       </w:r>
       <w:r>
+        <w:rPr>
+          <w:rFonts w:cs="Arial"/>
+        </w:rPr>
         <w:t>.</w:t>
       </w:r>
     </w:p>
@@ -3526,25 +3608,53 @@
           <w:ilvl w:val="0"/>
           <w:numId w:val="6"/>
         </w:numPr>
-      </w:pPr>
-      <w:r>
-        <w:rPr>
+        <w:rPr>
+          <w:rFonts w:cs="Arial"/>
+        </w:rPr>
+      </w:pPr>
+      <w:r>
+        <w:rPr>
+          <w:rFonts w:cs="Arial"/>
           <w:b/>
           <w:bCs/>
         </w:rPr>
         <w:t>Conflict Resolution:</w:t>
       </w:r>
       <w:r>
-        <w:t xml:space="preserve"> If a user reads a scripture offline, the app should save their progress locally and push that update to Supabase the next time an internet connection is detected.</w:t>
-      </w:r>
-      <w:r>
+        <w:rPr>
+          <w:rFonts w:cs="Arial"/>
+        </w:rPr>
+        <w:t xml:space="preserve"> If a user reads a scripture offline, the app should save their progress locally and push that update to Supabase the next time an internet connection </w:t>
+      </w:r>
+      <w:proofErr w:type="gramStart"/>
+      <w:r>
+        <w:rPr>
+          <w:rFonts w:cs="Arial"/>
+        </w:rPr>
+        <w:t>is detected</w:t>
+      </w:r>
+      <w:proofErr w:type="gramEnd"/>
+      <w:r>
+        <w:rPr>
+          <w:rFonts w:cs="Arial"/>
+        </w:rPr>
+        <w:t>.</w:t>
+      </w:r>
+      <w:r>
+        <w:rPr>
+          <w:rFonts w:cs="Arial"/>
+        </w:rPr>
         <w:br/>
       </w:r>
       <w:r>
+        <w:rPr>
+          <w:rFonts w:cs="Arial"/>
+        </w:rPr>
         <w:br/>
       </w:r>
       <w:r>
         <w:rPr>
+          <w:rFonts w:cs="Arial"/>
           <w:b/>
           <w:bCs/>
         </w:rPr>
@@ -3552,6 +3662,7 @@
       </w:r>
       <w:r>
         <w:rPr>
+          <w:rFonts w:cs="Arial"/>
           <w:b/>
           <w:bCs/>
         </w:rPr>
@@ -3559,35 +3670,48 @@
       </w:r>
       <w:r>
         <w:rPr>
+          <w:rFonts w:cs="Arial"/>
           <w:b/>
           <w:bCs/>
         </w:rPr>
         <w:t xml:space="preserve"> API key</w:t>
       </w:r>
       <w:r>
+        <w:rPr>
+          <w:rFonts w:cs="Arial"/>
+        </w:rPr>
         <w:t xml:space="preserve">: </w:t>
       </w:r>
       <w:r>
+        <w:rPr>
+          <w:rFonts w:cs="Arial"/>
+        </w:rPr>
         <w:t>sb_publishable_ZY3xYN9IoLSdtI50mSLOGg_Z53mLJsg</w:t>
       </w:r>
       <w:r>
+        <w:rPr>
+          <w:rFonts w:cs="Arial"/>
+        </w:rPr>
         <w:t xml:space="preserve"> </w:t>
       </w:r>
     </w:p>
     <w:p>
       <w:pPr>
         <w:rPr>
+          <w:rFonts w:cs="Arial"/>
           <w:color w:val="FF0000"/>
         </w:rPr>
       </w:pPr>
       <w:r>
         <w:rPr>
+          <w:rFonts w:cs="Arial"/>
           <w:color w:val="FF0000"/>
         </w:rPr>
         <w:t>W</w:t>
       </w:r>
       <w:r>
         <w:rPr>
+          <w:rFonts w:cs="Arial"/>
           <w:color w:val="FF0000"/>
         </w:rPr>
         <w:t>rapping up the Elaboration Phase.</w:t>
@@ -3596,6 +3720,7 @@
     <w:p>
       <w:pPr>
         <w:rPr>
+          <w:rFonts w:cs="Arial"/>
           <w:lang w:val="en-ZA"/>
         </w:rPr>
       </w:pPr>

</xml_diff>

<commit_message>
Added Admin Dashboard screen
</commit_message>
<xml_diff>
--- a/docs/SPMP.docx
+++ b/docs/SPMP.docx
@@ -808,7 +808,14 @@
           <w:rFonts w:cs="Arial"/>
           <w:lang w:val="en-ZA"/>
         </w:rPr>
-        <w:t xml:space="preserve"> to $</w:t>
+        <w:t xml:space="preserve"> to </w:t>
+      </w:r>
+      <w:r>
+        <w:rPr>
+          <w:rFonts w:cs="Arial"/>
+          <w:lang w:val="en-ZA"/>
+        </w:rPr>
+        <w:t>R</w:t>
       </w:r>
       <w:r>
         <w:rPr>
@@ -851,7 +858,7 @@
           <w:rFonts w:cs="Arial"/>
           <w:lang w:val="en-ZA"/>
         </w:rPr>
-        <w:t xml:space="preserve"> Supabase offer free tiers that will likely cover the ministry's needs until the user base grows significantly.</w:t>
+        <w:t xml:space="preserve"> Supabase offer free tiers that will likely cover until the user base grows significantly.</w:t>
       </w:r>
     </w:p>
     <w:p>
@@ -1008,7 +1015,14 @@
           <w:rFonts w:cs="Arial"/>
           <w:lang w:val="en-ZA"/>
         </w:rPr>
-        <w:t xml:space="preserve"> The system must track and display user reading history, completed readings, and maintain a "Reading Streak" (e.g., 12 Days).</w:t>
+        <w:t xml:space="preserve"> The system must track and display user reading history, completed readings, and maintain a "Reading Streak"</w:t>
+      </w:r>
+      <w:r>
+        <w:rPr>
+          <w:rFonts w:cs="Arial"/>
+          <w:lang w:val="en-ZA"/>
+        </w:rPr>
+        <w:t>.</w:t>
       </w:r>
     </w:p>
     <w:p>
@@ -1710,21 +1724,7 @@
         <w:rPr>
           <w:rFonts w:cs="Arial"/>
         </w:rPr>
-        <w:t xml:space="preserve">I plan to </w:t>
-      </w:r>
-      <w:proofErr w:type="gramStart"/>
-      <w:r>
-        <w:rPr>
-          <w:rFonts w:cs="Arial"/>
-        </w:rPr>
-        <w:t>cache</w:t>
-      </w:r>
-      <w:proofErr w:type="gramEnd"/>
-      <w:r>
-        <w:rPr>
-          <w:rFonts w:cs="Arial"/>
-        </w:rPr>
-        <w:t xml:space="preserve"> this data locally on the user's device for offline reading, using standard React Native AsyncStorage </w:t>
+        <w:t xml:space="preserve">I plan to cache this data locally on the user's device for offline reading, using standard React Native AsyncStorage </w:t>
       </w:r>
     </w:p>
     <w:tbl>
@@ -2286,7 +2286,6 @@
                       <w:lang w:val="en-ZA" w:eastAsia="en-ZA"/>
                     </w:rPr>
                   </w:pPr>
-                  <w:proofErr w:type="spellStart"/>
                   <w:r>
                     <w:rPr>
                       <w:rFonts w:eastAsia="Times New Roman" w:cs="Arial"/>
@@ -2297,7 +2296,6 @@
                     </w:rPr>
                     <w:t>avatar_url</w:t>
                   </w:r>
-                  <w:proofErr w:type="spellEnd"/>
                 </w:p>
               </w:tc>
               <w:tc>
@@ -2347,7 +2345,6 @@
                       <w:lang w:val="en-ZA" w:eastAsia="en-ZA"/>
                     </w:rPr>
                   </w:pPr>
-                  <w:proofErr w:type="spellStart"/>
                   <w:r>
                     <w:rPr>
                       <w:rFonts w:eastAsia="Times New Roman" w:cs="Arial"/>
@@ -2358,7 +2355,6 @@
                     </w:rPr>
                     <w:t>current_streak</w:t>
                   </w:r>
-                  <w:proofErr w:type="spellEnd"/>
                 </w:p>
               </w:tc>
               <w:tc>
@@ -2408,7 +2404,6 @@
                       <w:lang w:val="en-ZA" w:eastAsia="en-ZA"/>
                     </w:rPr>
                   </w:pPr>
-                  <w:proofErr w:type="spellStart"/>
                   <w:r>
                     <w:rPr>
                       <w:rFonts w:eastAsia="Times New Roman" w:cs="Arial"/>
@@ -2419,7 +2414,6 @@
                     </w:rPr>
                     <w:t>is_admin</w:t>
                   </w:r>
-                  <w:proofErr w:type="spellEnd"/>
                 </w:p>
               </w:tc>
               <w:tc>
@@ -2469,7 +2463,6 @@
                       <w:lang w:val="en-ZA" w:eastAsia="en-ZA"/>
                     </w:rPr>
                   </w:pPr>
-                  <w:proofErr w:type="spellStart"/>
                   <w:r>
                     <w:rPr>
                       <w:rFonts w:eastAsia="Times New Roman" w:cs="Arial"/>
@@ -2480,7 +2473,6 @@
                     </w:rPr>
                     <w:t>text_size</w:t>
                   </w:r>
-                  <w:proofErr w:type="spellEnd"/>
                 </w:p>
               </w:tc>
               <w:tc>
@@ -2530,7 +2522,6 @@
                       <w:lang w:val="en-ZA" w:eastAsia="en-ZA"/>
                     </w:rPr>
                   </w:pPr>
-                  <w:proofErr w:type="spellStart"/>
                   <w:r>
                     <w:rPr>
                       <w:rFonts w:eastAsia="Times New Roman" w:cs="Arial"/>
@@ -2541,7 +2532,6 @@
                     </w:rPr>
                     <w:t>high_contrast</w:t>
                   </w:r>
-                  <w:proofErr w:type="spellEnd"/>
                 </w:p>
               </w:tc>
               <w:tc>
@@ -2591,7 +2581,6 @@
                       <w:lang w:val="en-ZA" w:eastAsia="en-ZA"/>
                     </w:rPr>
                   </w:pPr>
-                  <w:proofErr w:type="spellStart"/>
                   <w:r>
                     <w:rPr>
                       <w:rFonts w:eastAsia="Times New Roman" w:cs="Arial"/>
@@ -2602,7 +2591,6 @@
                     </w:rPr>
                     <w:t>notifications_enabled</w:t>
                   </w:r>
-                  <w:proofErr w:type="spellEnd"/>
                 </w:p>
               </w:tc>
               <w:tc>
@@ -2652,7 +2640,6 @@
                       <w:lang w:val="en-ZA" w:eastAsia="en-ZA"/>
                     </w:rPr>
                   </w:pPr>
-                  <w:proofErr w:type="spellStart"/>
                   <w:r>
                     <w:rPr>
                       <w:rFonts w:eastAsia="Times New Roman" w:cs="Arial"/>
@@ -2663,7 +2650,6 @@
                     </w:rPr>
                     <w:t>last_updated</w:t>
                   </w:r>
-                  <w:proofErr w:type="spellEnd"/>
                 </w:p>
               </w:tc>
               <w:tc>
@@ -2745,7 +2731,6 @@
                 <w:lang w:val="en-ZA"/>
               </w:rPr>
             </w:pPr>
-            <w:proofErr w:type="spellStart"/>
             <w:r>
               <w:rPr>
                 <w:rFonts w:cs="Arial"/>
@@ -2755,7 +2740,6 @@
               </w:rPr>
               <w:t>Daily_Readings</w:t>
             </w:r>
-            <w:proofErr w:type="spellEnd"/>
           </w:p>
         </w:tc>
         <w:tc>
@@ -3884,21 +3868,7 @@
         <w:rPr>
           <w:rFonts w:cs="Arial"/>
         </w:rPr>
-        <w:t xml:space="preserve">For offline capabilities in your React Native app, the following will be implemented for </w:t>
-      </w:r>
-      <w:proofErr w:type="gramStart"/>
-      <w:r>
-        <w:rPr>
-          <w:rFonts w:cs="Arial"/>
-        </w:rPr>
-        <w:t>a specific</w:t>
-      </w:r>
-      <w:proofErr w:type="gramEnd"/>
-      <w:r>
-        <w:rPr>
-          <w:rFonts w:cs="Arial"/>
-        </w:rPr>
-        <w:t xml:space="preserve"> data flow:</w:t>
+        <w:t>For offline capabilities in your React Native app, the following will be implemented for a specific data flow:</w:t>
       </w:r>
     </w:p>
     <w:p>

</xml_diff>